<commit_message>
UST-04 v2: diagnostico confirmado por sonda (guess pisa tipo; score = cobertura 2 capas, no pipeline)
</commit_message>
<xml_diff>
--- a/_integration/docs/ust/UST-2026-08-20-04-escaner-de-verdad.docx
+++ b/_integration/docs/ust/UST-2026-08-20-04-escaner-de-verdad.docx
@@ -313,7 +313,7 @@
                 <w:szCs w:val="19"/>
                 <w:rFonts w:ascii="Calibri" w:cs="Calibri" w:eastAsia="Calibri" w:hAnsi="Calibri"/>
               </w:rPr>
-              <w:t xml:space="preserve">CAUSA LOCALIZADA en código: tipoValido() deja que el meal_type_guess de la visión PISE la elección visible (reloj o chip manual), en silencio y sin forma de corregirlo después. Fix: la elección MANUAL manda siempre; el guess solo rellena si la usuaria no tocó (respaldo declarado, r12-b4). Y el tipo se puede cambiar TAMBIÉN en la pantalla de resultados y al guardar. La sonda-pilar (SQL de hoy) confirma la secuencia real antes de dar el diagnóstico por cerrado.</w:t>
+              <w:t xml:space="preserve">CONFIRMADO EN BASE (sonda 21-ago): sus capturas de las 11:17 (20-ago) y 11:56 (21-ago) quedaron como dinner — a esa hora el reloj propone lunch; el guess de la visión pisó la elección dos días seguidos (tipoValido() lo deja ganar SIEMPRE). Fix: la elección MANUAL manda; el guess solo rellena si la usuaria no tocó (respaldo declarado, r12-b4); y el tipo se puede cambiar TAMBIÉN en resultados y al guardar.</w:t>
             </w:r>
           </w:p>
         </w:tc>
@@ -411,7 +411,7 @@
                 <w:szCs w:val="19"/>
                 <w:rFonts w:ascii="Calibri" w:cs="Calibri" w:eastAsia="Calibri" w:hAnsi="Calibri"/>
               </w:rPr>
-              <w:t xml:space="preserve">Verificación de la CADENA ENTERA con dato real (r18-d): confirmar → meal_logs → ns_alineacion_del_dia → tiers → component3 v2 → anillo. La sonda dirá dónde se corta para SU cuenta (candidatos: ventana local vs fecha del log mal tipado de F1; capturas confirmed sin fila; matcher a cero → F3/F4). Se arregla el eslabón que salga + refresh de Today/Progress al volver (focus). Si el día no tiene comida CASADA, el anillo usa el respaldo — eso es F4 hecho visible.</w:t>
+              <w:t xml:space="preserve">SONDA CONCLUYENTE (21-ago): la cadena NO está rota — alignment_stats existe y cuenta casados (3/5, 5/6). El score nunca NACE: de 28 items en 48h solo 4 tienen tier. Capa A: ~40% SIN CASAR. Capa B (la sorpresa): alimentos CASADOS sin peso para Luteal-Mid en la hoja (Sausage, Polenta, Mushrooms, Couscous, Salmon, Chorizo, Empanada, Tomates, Pepino → tier null). Con 0 tiers, el anillo cae al respaldo del checklist… retirado del Today en 0.22.5 → su score no se mueve. Fix: anillo honesto («sin datos de alineación aún», no un 0 mudo) + verificación de meal_alignment v3 con item controlado (Carrots → Good debe persistir) + refresh al volver + matcher v2: normalización singular/plural y prefijos (Boiled egg→Eggs) y preferencia por alimento BASE sobre plato compuesto (cazado: Onion→Onion Rings).</w:t>
             </w:r>
           </w:p>
         </w:tc>
@@ -509,7 +509,7 @@
                 <w:szCs w:val="19"/>
                 <w:rFonts w:ascii="Calibri" w:cs="Calibri" w:eastAsia="Calibri" w:hAnsi="Calibri"/>
               </w:rPr>
-              <w:t xml:space="preserve">Tabla alignment_gaps (nombre normalizado, veces vista, primera/última, ejemplo de captura) que meal_alignment alimenta al no casar. RPC admin + bloque en Obs. piloto (gráfica y tabla top gaps) + sección en el correo de founders del lunes (🥗 ya existe: se añade top-10 gaps y % sin casar). Pilar/Constanza enriquecen la hoja; Lucía el naming de UI. La hoja de Constanza sigue siendo LA verdad del tier (regla 11-ago).</w:t>
+              <w:t xml:space="preserve">Tabla alignment_gaps que meal_alignment alimenta con LAS DOS CAPAS que la sonda destapó: (A) nombre sin casar y (B) casado SIN peso para el segmento del día — a la hoja le faltan filas de Luteal-Mid, no solo alimentos. RPC admin + bloque en Obs. piloto + top-10 y % sin casar en el correo de founders del lunes (🥗 ya existe). Semilla YA disponible de la sonda: capa A = tomato/cream sauce, grated cheese, roast beef, salad dressing, savory pastry, boiled egg, red wine, mixed salad; capa B = los 9 casados sin tier de Luteal-Mid. Pilar/Constanza enriquecen la hoja; Lucía el naming. La hoja de Constanza sigue siendo LA verdad del tier (regla 11-ago).</w:t>
             </w:r>
           </w:p>
         </w:tc>

</xml_diff>